<commit_message>
Per-person mailbox scan schedule: 1-2 times a day, weekends, scope; skip e-mails a colleague's scan already sent to AI
- GmailConnection: auto_scan, scan_hour_1 / scan_hour_2 (6 am-9 pm LA, at least 3 h apart), scan_weekends,
  scan_scope (my projects / + pinned / all for management), last_auto_at
- Cloud Scheduler runs hourly (one job, same cost); scan_all() scans only mailboxes that are due and
  defers the rest to the next hour after a 300 s budget
- ScannedMessage.rfc_id: the same e-mail in two mailboxes goes to AI once per project
- at most 15 projects per mailbox per scan; the rest continue next scan
- settings card on the mailbox page with the person's AI calls and estimated cost for 30 days
- English strings, docs and user guide updated

Co-Authored-By: Claude Opus 5.5 <noreply@anthropic.com>
Claude-Session: https://claude.ai/code/session_018GNKyNGoAef6uzYVErWxuK
</commit_message>
<xml_diff>
--- a/docs/TMS_User_Guide_Internal_Beta.docx
+++ b/docs/TMS_User_Guide_Internal_Beta.docx
@@ -2416,7 +2416,7 @@
         <w:spacing w:after="50"/>
       </w:pPr>
       <w:r>
-        <w:t xml:space="preserve">Every day at </w:t>
+        <w:t xml:space="preserve">At the times you choose (default </w:t>
       </w:r>
       <w:r>
         <w:rPr>
@@ -2426,7 +2426,27 @@
         <w:t xml:space="preserve">5:00 pm Los Angeles time</w:t>
       </w:r>
       <w:r>
-        <w:t xml:space="preserve"> the TMS searches your new e-mails for the container #, MBL # and carrier load # of running projects. E-mails that mention none of them are never opened.</w:t>
+        <w:t xml:space="preserve">, once a day) the TMS searches your new e-mails for the container #, MBL # and carrier load # of the running projects in your scan scope. E-mails that mention none of them are never opened.</w:t>
+      </w:r>
+    </w:p>
+    <w:p>
+      <w:pPr>
+        <w:pStyle w:val="ListParagraph"/>
+        <w:numPr>
+          <w:ilvl w:val="0"/>
+          <w:numId w:val="6"/>
+        </w:numPr>
+        <w:spacing w:after="50"/>
+      </w:pPr>
+      <w:r>
+        <w:rPr>
+          <w:b/>
+          <w:bCs/>
+        </w:rPr>
+        <w:t xml:space="preserve">My scan settings</w:t>
+      </w:r>
+      <w:r>
+        <w:t xml:space="preserve"> (same page): one or two scans a day (6 am to 9 pm, at least 3 hours apart), weekends on or off, and the scope: projects I own (default), plus projects pinned to my workspace, or all running projects (management only). The page shows your AI calls and estimated cost for the last 30 days.</w:t>
       </w:r>
     </w:p>
     <w:p>

</xml_diff>

<commit_message>
OP / RFQ see only the projects they own; creator owns a new project by default
- permissions.sees_all_projects: management, AP and AR see every project; others only projects they own
  (and those projects' Loads; Loads without a project stay visible)
- ProjectAccessMiddleware: pages of a project, Load, rate agreement, charge or Load row answer 404 when
  the project is not visible; lists, search, suggest, CSV export, bulk actions, workspace widgets, to-dos,
  project pickers and carrier / location history filtered the same way
- new project: the creator is ticked as owner and added when nobody is ticked
- user guide roles section updated

Co-Authored-By: Claude Opus 5.5 <noreply@anthropic.com>
Claude-Session: https://claude.ai/code/session_018GNKyNGoAef6uzYVErWxuK
</commit_message>
<xml_diff>
--- a/docs/TMS_User_Guide_Internal_Beta.docx
+++ b/docs/TMS_User_Guide_Internal_Beta.docx
@@ -873,7 +873,17 @@
         <w:t xml:space="preserve">Team</w:t>
       </w:r>
       <w:r>
-        <w:t xml:space="preserve"> page.</w:t>
+        <w:t xml:space="preserve"> page. </w:t>
+      </w:r>
+      <w:r>
+        <w:rPr>
+          <w:b/>
+          <w:bCs/>
+        </w:rPr>
+        <w:t xml:space="preserve">Management, AP and AR see every project. Operations and RFQ / Sales see only the projects they own</w:t>
+      </w:r>
+      <w:r>
+        <w:t xml:space="preserve"> (and those projects' Loads); whoever creates a project owns it by default, and to cover for a colleague a manager adds you as an owner of that project.</w:t>
       </w:r>
     </w:p>
     <w:tbl>
@@ -1088,7 +1098,7 @@
           </w:tcPr>
           <w:p>
             <w:r>
-              <w:t xml:space="preserve">Projects, Loads, legs, BOL, POD, permits, AI reading, mailbox scan, RFQ, carrier rate agreements.</w:t>
+              <w:t xml:space="preserve">Their own projects and those projects' Loads: legs, BOL, POD, permits, AI reading, mailbox scan, RFQ, carrier rate agreements.</w:t>
             </w:r>
           </w:p>
         </w:tc>
@@ -1110,7 +1120,7 @@
           </w:tcPr>
           <w:p>
             <w:r>
-              <w:t xml:space="preserve">AR and AP amounts (except the carrier rate on a rate agreement), margins.</w:t>
+              <w:t xml:space="preserve">Projects they do not own; AR and AP amounts (except the carrier rate on a rate agreement), margins.</w:t>
             </w:r>
           </w:p>
         </w:tc>

</xml_diff>